<commit_message>
Fillimi i raportit 2 dhe prezantimit
</commit_message>
<xml_diff>
--- a/Raporti_teknik1_FlorentMuqa.docx
+++ b/Raporti_teknik1_FlorentMuqa.docx
@@ -496,12 +496,6 @@
         <w:gridCol w:w="6921"/>
       </w:tblGrid>
       <w:tr>
-        <w:tblPrEx>
-          <w:tblCellMar>
-            <w:top w:w="0" w:type="dxa"/>
-            <w:bottom w:w="0" w:type="dxa"/>
-          </w:tblCellMar>
-        </w:tblPrEx>
         <w:trPr>
           <w:trHeight w:val="194"/>
         </w:trPr>
@@ -630,12 +624,6 @@
         </w:tc>
       </w:tr>
       <w:tr>
-        <w:tblPrEx>
-          <w:tblCellMar>
-            <w:top w:w="0" w:type="dxa"/>
-            <w:bottom w:w="0" w:type="dxa"/>
-          </w:tblCellMar>
-        </w:tblPrEx>
         <w:trPr>
           <w:trHeight w:val="194"/>
         </w:trPr>
@@ -720,12 +708,6 @@
         </w:tc>
       </w:tr>
       <w:tr>
-        <w:tblPrEx>
-          <w:tblCellMar>
-            <w:top w:w="0" w:type="dxa"/>
-            <w:bottom w:w="0" w:type="dxa"/>
-          </w:tblCellMar>
-        </w:tblPrEx>
         <w:trPr>
           <w:trHeight w:val="194"/>
         </w:trPr>
@@ -798,12 +780,6 @@
         </w:tc>
       </w:tr>
       <w:tr>
-        <w:tblPrEx>
-          <w:tblCellMar>
-            <w:top w:w="0" w:type="dxa"/>
-            <w:bottom w:w="0" w:type="dxa"/>
-          </w:tblCellMar>
-        </w:tblPrEx>
         <w:trPr>
           <w:trHeight w:val="185"/>
         </w:trPr>
@@ -888,12 +864,6 @@
         </w:tc>
       </w:tr>
       <w:tr>
-        <w:tblPrEx>
-          <w:tblCellMar>
-            <w:top w:w="0" w:type="dxa"/>
-            <w:bottom w:w="0" w:type="dxa"/>
-          </w:tblCellMar>
-        </w:tblPrEx>
         <w:trPr>
           <w:trHeight w:val="194"/>
         </w:trPr>
@@ -5101,21 +5071,7 @@
         <w:rPr>
           <w:rFonts w:asciiTheme="majorHAnsi" w:eastAsia="Arial" w:hAnsiTheme="majorHAnsi" w:cstheme="majorHAnsi"/>
         </w:rPr>
-        <w:t xml:space="preserve"> </w:t>
-      </w:r>
-      <w:proofErr w:type="spellStart"/>
-      <w:r>
-        <w:rPr>
-          <w:rFonts w:asciiTheme="majorHAnsi" w:eastAsia="Arial" w:hAnsiTheme="majorHAnsi" w:cstheme="majorHAnsi"/>
-        </w:rPr>
-        <w:t>të</w:t>
-      </w:r>
-      <w:proofErr w:type="spellEnd"/>
-      <w:r>
-        <w:rPr>
-          <w:rFonts w:asciiTheme="majorHAnsi" w:eastAsia="Arial" w:hAnsiTheme="majorHAnsi" w:cstheme="majorHAnsi"/>
-        </w:rPr>
-        <w:t xml:space="preserve"> </w:t>
+        <w:t xml:space="preserve"> të </w:t>
       </w:r>
       <w:proofErr w:type="spellStart"/>
       <w:r>
@@ -7560,25 +7516,7 @@
           <w:i/>
           <w:iCs/>
         </w:rPr>
-        <w:t xml:space="preserve"> </w:t>
-      </w:r>
-      <w:proofErr w:type="spellStart"/>
-      <w:r>
-        <w:rPr>
-          <w:rFonts w:asciiTheme="majorHAnsi" w:hAnsiTheme="majorHAnsi" w:cstheme="majorHAnsi"/>
-          <w:i/>
-          <w:iCs/>
-        </w:rPr>
-        <w:t>te</w:t>
-      </w:r>
-      <w:proofErr w:type="spellEnd"/>
-      <w:r>
-        <w:rPr>
-          <w:rFonts w:asciiTheme="majorHAnsi" w:hAnsiTheme="majorHAnsi" w:cstheme="majorHAnsi"/>
-          <w:i/>
-          <w:iCs/>
-        </w:rPr>
-        <w:t xml:space="preserve"> </w:t>
+        <w:t xml:space="preserve"> te </w:t>
       </w:r>
       <w:proofErr w:type="spellStart"/>
       <w:r>
@@ -11456,7 +11394,6 @@
     </w:p>
     <w:p>
       <w:pPr>
-        <w:spacing w:after="80" w:line="276" w:lineRule="auto"/>
         <w:rPr>
           <w:rFonts w:asciiTheme="majorHAnsi" w:hAnsiTheme="majorHAnsi" w:cstheme="majorHAnsi"/>
         </w:rPr>
@@ -11466,6 +11403,216 @@
       <w:pPr>
         <w:rPr>
           <w:rFonts w:asciiTheme="majorHAnsi" w:hAnsiTheme="majorHAnsi" w:cstheme="majorHAnsi"/>
+        </w:rPr>
+      </w:pPr>
+    </w:p>
+    <w:p>
+      <w:pPr>
+        <w:rPr>
+          <w:rFonts w:asciiTheme="majorHAnsi" w:hAnsiTheme="majorHAnsi" w:cstheme="majorHAnsi"/>
+        </w:rPr>
+      </w:pPr>
+    </w:p>
+    <w:p>
+      <w:pPr>
+        <w:rPr>
+          <w:rFonts w:asciiTheme="majorHAnsi" w:hAnsiTheme="majorHAnsi" w:cstheme="majorHAnsi"/>
+        </w:rPr>
+      </w:pPr>
+    </w:p>
+    <w:p>
+      <w:pPr>
+        <w:rPr>
+          <w:rFonts w:asciiTheme="majorHAnsi" w:hAnsiTheme="majorHAnsi" w:cstheme="majorHAnsi"/>
+        </w:rPr>
+      </w:pPr>
+    </w:p>
+    <w:p>
+      <w:pPr>
+        <w:rPr>
+          <w:rFonts w:asciiTheme="majorHAnsi" w:hAnsiTheme="majorHAnsi" w:cstheme="majorHAnsi"/>
+        </w:rPr>
+      </w:pPr>
+    </w:p>
+    <w:p>
+      <w:pPr>
+        <w:rPr>
+          <w:rFonts w:asciiTheme="majorHAnsi" w:hAnsiTheme="majorHAnsi" w:cstheme="majorHAnsi"/>
+        </w:rPr>
+      </w:pPr>
+    </w:p>
+    <w:p>
+      <w:pPr>
+        <w:rPr>
+          <w:rFonts w:asciiTheme="majorHAnsi" w:hAnsiTheme="majorHAnsi" w:cstheme="majorHAnsi"/>
+        </w:rPr>
+      </w:pPr>
+    </w:p>
+    <w:p>
+      <w:pPr>
+        <w:rPr>
+          <w:rFonts w:asciiTheme="majorHAnsi" w:hAnsiTheme="majorHAnsi" w:cstheme="majorHAnsi"/>
+        </w:rPr>
+      </w:pPr>
+    </w:p>
+    <w:p>
+      <w:pPr>
+        <w:rPr>
+          <w:rFonts w:asciiTheme="majorHAnsi" w:hAnsiTheme="majorHAnsi" w:cstheme="majorHAnsi"/>
+        </w:rPr>
+      </w:pPr>
+    </w:p>
+    <w:p>
+      <w:pPr>
+        <w:rPr>
+          <w:rFonts w:asciiTheme="majorHAnsi" w:hAnsiTheme="majorHAnsi" w:cstheme="majorHAnsi"/>
+        </w:rPr>
+      </w:pPr>
+    </w:p>
+    <w:p>
+      <w:pPr>
+        <w:rPr>
+          <w:rFonts w:asciiTheme="majorHAnsi" w:hAnsiTheme="majorHAnsi" w:cstheme="majorHAnsi"/>
+        </w:rPr>
+      </w:pPr>
+    </w:p>
+    <w:p>
+      <w:pPr>
+        <w:jc w:val="center"/>
+        <w:rPr>
+          <w:rFonts w:asciiTheme="majorHAnsi" w:hAnsiTheme="majorHAnsi" w:cstheme="majorHAnsi"/>
+          <w:b/>
+          <w:bCs/>
+          <w:i/>
+          <w:iCs/>
+          <w:color w:val="8EAADB" w:themeColor="accent1" w:themeTint="99"/>
+          <w:sz w:val="32"/>
+          <w:szCs w:val="32"/>
+        </w:rPr>
+      </w:pPr>
+      <w:r>
+        <w:rPr>
+          <w:rFonts w:asciiTheme="majorHAnsi" w:hAnsiTheme="majorHAnsi" w:cstheme="majorHAnsi"/>
+          <w:b/>
+          <w:bCs/>
+          <w:i/>
+          <w:iCs/>
+          <w:color w:val="8EAADB" w:themeColor="accent1" w:themeTint="99"/>
+          <w:sz w:val="32"/>
+          <w:szCs w:val="32"/>
+        </w:rPr>
+        <w:lastRenderedPageBreak/>
+        <w:t xml:space="preserve">RAPORTI TEKNIK </w:t>
+      </w:r>
+      <w:r>
+        <w:rPr>
+          <w:rFonts w:asciiTheme="majorHAnsi" w:hAnsiTheme="majorHAnsi" w:cstheme="majorHAnsi"/>
+          <w:b/>
+          <w:bCs/>
+          <w:i/>
+          <w:iCs/>
+          <w:color w:val="8EAADB" w:themeColor="accent1" w:themeTint="99"/>
+          <w:sz w:val="32"/>
+          <w:szCs w:val="32"/>
+        </w:rPr>
+        <w:t>2</w:t>
+      </w:r>
+    </w:p>
+    <w:p>
+      <w:pPr>
+        <w:jc w:val="center"/>
+        <w:rPr>
+          <w:rFonts w:asciiTheme="majorHAnsi" w:hAnsiTheme="majorHAnsi" w:cstheme="majorHAnsi"/>
+          <w:b/>
+          <w:bCs/>
+          <w:color w:val="000000" w:themeColor="text1"/>
+          <w:sz w:val="28"/>
+          <w:szCs w:val="28"/>
+        </w:rPr>
+      </w:pPr>
+      <w:proofErr w:type="spellStart"/>
+      <w:r>
+        <w:rPr>
+          <w:rFonts w:asciiTheme="majorHAnsi" w:hAnsiTheme="majorHAnsi" w:cstheme="majorHAnsi"/>
+          <w:b/>
+          <w:bCs/>
+          <w:color w:val="000000" w:themeColor="text1"/>
+          <w:sz w:val="28"/>
+          <w:szCs w:val="28"/>
+        </w:rPr>
+        <w:t>Databaza</w:t>
+      </w:r>
+      <w:proofErr w:type="spellEnd"/>
+      <w:r>
+        <w:rPr>
+          <w:rFonts w:asciiTheme="majorHAnsi" w:hAnsiTheme="majorHAnsi" w:cstheme="majorHAnsi"/>
+          <w:b/>
+          <w:bCs/>
+          <w:color w:val="000000" w:themeColor="text1"/>
+          <w:sz w:val="28"/>
+          <w:szCs w:val="28"/>
+        </w:rPr>
+        <w:t>, backend-</w:t>
+      </w:r>
+      <w:proofErr w:type="spellStart"/>
+      <w:r>
+        <w:rPr>
+          <w:rFonts w:asciiTheme="majorHAnsi" w:hAnsiTheme="majorHAnsi" w:cstheme="majorHAnsi"/>
+          <w:b/>
+          <w:bCs/>
+          <w:color w:val="000000" w:themeColor="text1"/>
+          <w:sz w:val="28"/>
+          <w:szCs w:val="28"/>
+        </w:rPr>
+        <w:t>i</w:t>
+      </w:r>
+      <w:proofErr w:type="spellEnd"/>
+      <w:r>
+        <w:rPr>
+          <w:rFonts w:asciiTheme="majorHAnsi" w:hAnsiTheme="majorHAnsi" w:cstheme="majorHAnsi"/>
+          <w:b/>
+          <w:bCs/>
+          <w:color w:val="000000" w:themeColor="text1"/>
+          <w:sz w:val="28"/>
+          <w:szCs w:val="28"/>
+        </w:rPr>
+        <w:t xml:space="preserve"> </w:t>
+      </w:r>
+      <w:proofErr w:type="spellStart"/>
+      <w:r>
+        <w:rPr>
+          <w:rFonts w:asciiTheme="majorHAnsi" w:hAnsiTheme="majorHAnsi" w:cstheme="majorHAnsi"/>
+          <w:b/>
+          <w:bCs/>
+          <w:color w:val="000000" w:themeColor="text1"/>
+          <w:sz w:val="28"/>
+          <w:szCs w:val="28"/>
+        </w:rPr>
+        <w:t>dhe</w:t>
+      </w:r>
+      <w:proofErr w:type="spellEnd"/>
+      <w:r>
+        <w:rPr>
+          <w:rFonts w:asciiTheme="majorHAnsi" w:hAnsiTheme="majorHAnsi" w:cstheme="majorHAnsi"/>
+          <w:b/>
+          <w:bCs/>
+          <w:color w:val="000000" w:themeColor="text1"/>
+          <w:sz w:val="28"/>
+          <w:szCs w:val="28"/>
+        </w:rPr>
+        <w:t xml:space="preserve"> API</w:t>
+      </w:r>
+    </w:p>
+    <w:p>
+      <w:pPr>
+        <w:jc w:val="center"/>
+        <w:rPr>
+          <w:rFonts w:asciiTheme="majorHAnsi" w:hAnsiTheme="majorHAnsi" w:cstheme="majorHAnsi"/>
+          <w:b/>
+          <w:bCs/>
+          <w:color w:val="000000" w:themeColor="text1"/>
+          <w:sz w:val="28"/>
+          <w:szCs w:val="28"/>
         </w:rPr>
       </w:pPr>
     </w:p>
@@ -11621,15 +11768,6 @@
   </w:num>
   <w:num w:numId="2" w16cid:durableId="877863698">
     <w:abstractNumId w:val="0"/>
-    <w:lvlOverride w:ilvl="0"/>
-    <w:lvlOverride w:ilvl="1"/>
-    <w:lvlOverride w:ilvl="2"/>
-    <w:lvlOverride w:ilvl="3"/>
-    <w:lvlOverride w:ilvl="4"/>
-    <w:lvlOverride w:ilvl="5"/>
-    <w:lvlOverride w:ilvl="6"/>
-    <w:lvlOverride w:ilvl="7"/>
-    <w:lvlOverride w:ilvl="8"/>
   </w:num>
 </w:numbering>
 </file>
@@ -12236,6 +12374,7 @@
   <w:style w:type="character" w:default="1" w:styleId="DefaultParagraphFont">
     <w:name w:val="Default Paragraph Font"/>
     <w:uiPriority w:val="1"/>
+    <w:semiHidden/>
     <w:unhideWhenUsed/>
   </w:style>
   <w:style w:type="table" w:default="1" w:styleId="TableNormal">

</xml_diff>